<commit_message>
Update HW2 docx with fixed git links
Co-authored-by: Cursor <cursoragent@cursor.com>
</commit_message>
<xml_diff>
--- a/08_function_calling/HOMEWORK2_Yashvi_Gupta.docx
+++ b/08_function_calling/HOMEWORK2_Yashvi_Gupta.docx
@@ -211,6 +211,14 @@
           <w:b/>
         </w:rPr>
         <w:t>Multi-Agent Orchestration (LAB 1)</w:t>
+      </w:r>
+      <w:r>
+        <w:rPr>
+          <w:color w:val="0563C1"/>
+          <w:sz w:val="18"/>
+        </w:rPr>
+        <w:br/>
+        <w:t>https://github.com/yashvigupta7/dsai/blob/main/06_agents/LAB_prompt_design.py</w:t>
       </w:r>
     </w:p>
     <w:tbl>
@@ -448,6 +456,14 @@
           <w:b/>
         </w:rPr>
         <w:t>RAG Implementation (LAB 2)</w:t>
+      </w:r>
+      <w:r>
+        <w:rPr>
+          <w:color w:val="0563C1"/>
+          <w:sz w:val="18"/>
+        </w:rPr>
+        <w:br/>
+        <w:t>https://github.com/yashvigupta7/dsai/blob/main/07_rag/LAB_custom_rag_query.R</w:t>
       </w:r>
     </w:p>
     <w:tbl>
@@ -695,6 +711,14 @@
           <w:b/>
         </w:rPr>
         <w:t>Function Calling / Multi-Agent with Tools (LAB 3)</w:t>
+      </w:r>
+      <w:r>
+        <w:rPr>
+          <w:color w:val="0563C1"/>
+          <w:sz w:val="18"/>
+        </w:rPr>
+        <w:br/>
+        <w:t>https://github.com/yashvigupta7/dsai/blob/main/08_function_calling/LAB_multi_agent_with_tools.py</w:t>
       </w:r>
     </w:p>
     <w:tbl>

</xml_diff>